<commit_message>
docs: publish DDS-8555 assignment 4 deliverables
</commit_message>
<xml_diff>
--- a/Week 4/Assignment 4/MaldonadoJDDS8555-4.docx
+++ b/Week 4/Assignment 4/MaldonadoJDDS8555-4.docx
@@ -86,7 +86,7 @@
           <w:b w:val="0"/>
           <w:i w:val="0"/>
         </w:rPr>
-        <w:t>June 07, 2026</w:t>
+        <w:t>June 11, 2026</w:t>
       </w:r>
     </w:p>
     <w:p>
@@ -136,7 +136,7 @@
           <w:b w:val="0"/>
           <w:i w:val="0"/>
         </w:rPr>
-        <w:t>This assignment moved beyond straight-line regression by evaluating nonlinear horsepower behavior in the Auto data and nonlinear tree-based models in the Abalone competition.  The conceptual basis-function question showed how a knot changes the slope and curvature of a fitted function.  In the applied work, polynomial regression, step functions, and cubic splines all made the mpg-horsepower relationship visible rather than treating nonlinearity as a vague modeling claim.</w:t>
+        <w:t>This assignment moved beyond straight-line regression by evaluating nonlinear horsepower behavior in the Auto data and Chapter 7 nonlinear basis expansions in the Abalone competition.  The conceptual basis-function question now includes both the algebra and the requested sketch, which shows the continuous knot at X = 1 and the downward bend after the knot.  In the applied work, polynomial regression, step functions, and cubic splines make the mpg-horsepower relationship visible rather than treating nonlinearity as a vague modeling claim (James et al., 2023).</w:t>
       </w:r>
     </w:p>
     <w:p>
@@ -162,7 +162,7 @@
           <w:b w:val="0"/>
           <w:i w:val="0"/>
         </w:rPr>
-        <w:t>The Auto analysis compares polynomial regression, step functions, and cubic splines with 5-fold cross-validation.  The fitted plots and error tables show that mpg falls quickly as horsepower increases and then flattens among high-horsepower cars.  A straight line misses that curvature, while the nonlinear alternatives make the shape visible.  Polynomial regression is smooth but can wiggle at the boundaries, step functions are easy to read but impose abrupt jumps, and splines give a smoother local fit.</w:t>
+        <w:t>The Auto analysis compares polynomial regression, step functions, and cubic splines with 5-fold cross-validation.  The fitted plots and error tables show that mpg falls quickly as horsepower increases and then flattens among high-horsepower cars.  The best polynomial degree is reported, but the notebook also notes when a lower-degree curve is nearly tied and may be preferable for explanation.  That point matters because high-degree polynomials can look better by a small validation margin while becoming less stable at the boundaries.</w:t>
       </w:r>
     </w:p>
     <w:p>
@@ -175,7 +175,7 @@
           <w:b/>
           <w:i w:val="0"/>
         </w:rPr>
-        <w:t>Kaggle Model 1: Gradient Boosting</w:t>
+        <w:t>Kaggle Model 1: Polynomial Ridge</w:t>
       </w:r>
     </w:p>
     <w:p>
@@ -188,7 +188,7 @@
           <w:b w:val="0"/>
           <w:i w:val="0"/>
         </w:rPr>
-        <w:t>The first nonlinear Abalone submission used gradient boosting.  Gradient boosting performed best among the two nonlinear submissions, with public/private scores of 0.14815/0.14754.  This is consistent with boosting's ability to build a sequence of weak learners that focus on remaining error (Friedman, 2001).  The notebook reports validation RMSLE and feature importances so the result is not only a leaderboard score.</w:t>
+        <w:t>The first fresh Abalone submission uses second-degree polynomial terms for the numeric measurements and ridge regression for stabilization.  This model stays inside the Week 4 nonlinear framework while acknowledging the collinearity created by body-size and weight measurements.  The submitted file, `A4_polynomial_ridge_chapter7_playground_series_s4e4.csv`, received public/private scores of 0.15683/0.15611.  The notebook reports validation RMSLE, a coefficient table, and the generated submission file so the leaderboard result can be traced back to the code.</w:t>
       </w:r>
     </w:p>
     <w:p>
@@ -201,7 +201,7 @@
           <w:b/>
           <w:i w:val="0"/>
         </w:rPr>
-        <w:t>Kaggle Model 2: Random Forest</w:t>
+        <w:t>Kaggle Model 2: Spline Ridge</w:t>
       </w:r>
     </w:p>
     <w:p>
@@ -214,7 +214,7 @@
           <w:b w:val="0"/>
           <w:i w:val="0"/>
         </w:rPr>
-        <w:t>The second nonlinear Abalone submission used a random forest.  The random forest public/private scores were 0.14970/0.15003.  This model averages many decorrelated trees, so it is useful as a variance-reduction comparison against boosting.  The feature-importance output shows that shell and weight measurements carry most of the nonlinear signal, which is consistent with the biological structure of the Abalone measurements (Nash et al., 1994).</w:t>
+        <w:t>The second fresh Abalone submission uses cubic spline basis functions with ridge regression.  The submitted file, `A4_spline_ridge_chapter7_playground_series_s4e4.csv`, received public/private scores of 0.15749/0.15716.  The spline model is more local than a global polynomial, so it can represent changes in growth rate across the observed measurement range.  That modeling choice is consistent with generalized additive modeling logic and with the biological setting, where ring count is related to growth but should not be interpreted as a causal effect of any one measurement (Hastie &amp; Tibshirani, 1990; Nash et al., 1994).</w:t>
       </w:r>
     </w:p>
     <w:p>
@@ -240,7 +240,7 @@
           <w:b w:val="0"/>
           <w:i w:val="0"/>
         </w:rPr>
-        <w:t>The assumption investigation checked missingness, cross-validated error, smoothness, boundary behavior, validation performance, residual logic, and overfitting risk.  The Abalone checks did not show missing values requiring imputation, but the notebook still documents the check because missing-data handling is part of defensible exploratory analysis (Little &amp; Rubin, 2019).  The notebook separates both Kaggle models, maps them to submission files, and includes submission evidence.  The public repository is `https://github.com/maldo81/dds-8555-predictive-analysis`, and the notebook path is `Week 4/Assignment 4/MaldonadoJDDS8555-4.ipynb`.</w:t>
+        <w:t>The assumption investigation checks missingness, physically impossible values, validation error, smoothness, boundary behavior, residual structure, error by fitted range, and overfitting risk.  The Abalone checks found nonpositive Height values, converted them to missing values, and used median imputation inside the modeling pipeline, which is more defensible than silently dropping rows (Little &amp; Rubin, 2019).  The notebook separates both Kaggle models, maps them to fresh submission files, and includes submission evidence from the Kaggle status file.  The public repository is `https://github.com/maldo81/dds-8555-predictive-analysis`, and the notebook path is `Week 4/Assignment 4/MaldonadoJDDS8555-4.ipynb`.  Exploratory checks are included because model fitting should begin by looking for data defects and structure, not only by comparing final scores (Tukey, 1977).</w:t>
       </w:r>
     </w:p>
     <w:p>
@@ -253,7 +253,7 @@
           <w:b w:val="0"/>
           <w:i w:val="0"/>
         </w:rPr>
-        <w:t>GitHub/code note: The Python notebook is the code artifact for this assignment and is ready to post with the submission.  The assignment prompt gives one page plus Python notebook as the length guidance, and the notebook carries the detailed output, diagnostics, and submission evidence.</w:t>
+        <w:t>GitHub/code note: The Python notebook is the code artifact for this assignment and is posted with the public submission repository.  The assignment prompt gives one page plus Python notebook as the length guidance, and the notebook carries the detailed output, diagnostics, and submission evidence.</w:t>
       </w:r>
     </w:p>
     <w:p>
@@ -277,15 +277,6 @@
           <w:i w:val="0"/>
         </w:rPr>
         <w:t>References</w:t>
-      </w:r>
-    </w:p>
-    <w:p>
-      <w:pPr>
-        <w:spacing w:line="480" w:lineRule="auto"/>
-        <w:ind w:left="720" w:hanging="720"/>
-      </w:pPr>
-      <w:r>
-        <w:t>Friedman, J.  H. (2001).  Greedy function approximation: A gradient boosting machine.  The Annals of Statistics, 29(5), 1189-1232. https://doi.org/10.1214/aos/1013203451</w:t>
       </w:r>
     </w:p>
     <w:p>
@@ -322,6 +313,15 @@
       </w:pPr>
       <w:r>
         <w:t>Nash, W.  J., Sellers, T.  L., Talbot, S.  R., Cawthorn, A.  J., &amp; Ford, W.  B. (1994).  The population biology of abalone (Haliotis species) in Tasmania.  I.  Blacklip abalone (H. rubra) from the north coast and islands of Bass Strait (Technical Report No.  48).  Sea Fisheries Division.</w:t>
+      </w:r>
+    </w:p>
+    <w:p>
+      <w:pPr>
+        <w:spacing w:line="480" w:lineRule="auto"/>
+        <w:ind w:left="720" w:hanging="720"/>
+      </w:pPr>
+      <w:r>
+        <w:t>Tukey, J.  W. (1977).  Exploratory data analysis.  Addison-Wesley.</w:t>
       </w:r>
     </w:p>
     <w:sectPr>

</xml_diff>

<commit_message>
docs: update assignment 4 alpha rationale
</commit_message>
<xml_diff>
--- a/Week 4/Assignment 4/MaldonadoJDDS8555-4.docx
+++ b/Week 4/Assignment 4/MaldonadoJDDS8555-4.docx
@@ -188,7 +188,7 @@
           <w:b w:val="0"/>
           <w:i w:val="0"/>
         </w:rPr>
-        <w:t>The first fresh Abalone submission uses second-degree polynomial terms for the numeric measurements and ridge regression for stabilization.  This model stays inside the Week 4 nonlinear framework while acknowledging the collinearity created by body-size and weight measurements.  The submitted file, `A4_polynomial_ridge_chapter7_playground_series_s4e4.csv`, received public/private scores of 0.15683/0.15611.  The notebook reports validation RMSLE, a coefficient table, and the generated submission file so the leaderboard result can be traced back to the code.</w:t>
+        <w:t>The first fresh Abalone submission uses second-degree polynomial terms for the numeric measurements and ridge regression for stabilization.  This model stays inside the Week 4 nonlinear framework while acknowledging the collinearity created by body-size and weight measurements.  The notebook now reports a small validation grid for the ridge alpha so the shrinkage choice is visible.  The submitted file, `A4_polynomial_ridge_chapter7_playground_series_s4e4.csv`, received fresh public/private scores of 0.15647/0.15562.  The notebook reports validation RMSLE, a coefficient table, and the generated submission file so the leaderboard result can be traced back to the code.</w:t>
       </w:r>
     </w:p>
     <w:p>
@@ -214,7 +214,7 @@
           <w:b w:val="0"/>
           <w:i w:val="0"/>
         </w:rPr>
-        <w:t>The second fresh Abalone submission uses cubic spline basis functions with ridge regression.  The submitted file, `A4_spline_ridge_chapter7_playground_series_s4e4.csv`, received public/private scores of 0.15749/0.15716.  The spline model is more local than a global polynomial, so it can represent changes in growth rate across the observed measurement range.  That modeling choice is consistent with generalized additive modeling logic and with the biological setting, where ring count is related to growth but should not be interpreted as a causal effect of any one measurement (Hastie &amp; Tibshirani, 1990; Nash et al., 1994).</w:t>
+        <w:t>The second fresh Abalone submission uses cubic spline basis functions with ridge regression.  The notebook reports the same alpha grid for this model, which prevents the ridge setting from looking arbitrary.  The submitted file, `A4_spline_ridge_chapter7_playground_series_s4e4.csv`, received fresh public/private scores of 0.15736/0.15705.  The spline model is more local than a global polynomial, so it can represent changes in growth rate across the observed measurement range.  That modeling choice is consistent with generalized additive modeling logic and with the biological setting, where ring count is related to growth but should not be interpreted as a causal effect of any one measurement (Hastie &amp; Tibshirani, 1990; Nash et al., 1994).</w:t>
       </w:r>
     </w:p>
     <w:p>

</xml_diff>